<commit_message>
Update to KiCAD v10. Set PCB placement origin. Export placement file.
</commit_message>
<xml_diff>
--- a/9LedCluster_Revision_Notes.docx
+++ b/9LedCluster_Revision_Notes.docx
@@ -1,6 +1,6 @@
 
 <file path=word/document.xml><?xml version="1.0" encoding="utf-8"?>
-<w:document xmlns:wpc="http://schemas.microsoft.com/office/word/2010/wordprocessingCanvas" xmlns:cx="http://schemas.microsoft.com/office/drawing/2014/chartex" xmlns:cx1="http://schemas.microsoft.com/office/drawing/2015/9/8/chartex" xmlns:cx2="http://schemas.microsoft.com/office/drawing/2015/10/21/chartex" xmlns:cx3="http://schemas.microsoft.com/office/drawing/2016/5/9/chartex" xmlns:cx4="http://schemas.microsoft.com/office/drawing/2016/5/10/chartex" xmlns:cx5="http://schemas.microsoft.com/office/drawing/2016/5/11/chartex" xmlns:cx6="http://schemas.microsoft.com/office/drawing/2016/5/12/chartex" xmlns:cx7="http://schemas.microsoft.com/office/drawing/2016/5/13/chartex" xmlns:cx8="http://schemas.microsoft.com/office/drawing/2016/5/14/chartex" xmlns:mc="http://schemas.openxmlformats.org/markup-compatibility/2006" xmlns:aink="http://schemas.microsoft.com/office/drawing/2016/ink" xmlns:am3d="http://schemas.microsoft.com/office/drawing/2017/model3d" xmlns:o="urn:schemas-microsoft-com:office:office" xmlns:oel="http://schemas.microsoft.com/office/2019/extlst" xmlns:r="http://schemas.openxmlformats.org/officeDocument/2006/relationships" xmlns:m="http://schemas.openxmlformats.org/officeDocument/2006/math" xmlns:v="urn:schemas-microsoft-com:vml" xmlns:wp14="http://schemas.microsoft.com/office/word/2010/wordprocessingDrawing" xmlns:wp="http://schemas.openxmlformats.org/drawingml/2006/wordprocessingDrawing" xmlns:w10="urn:schemas-microsoft-com:office:word" xmlns:w="http://schemas.openxmlformats.org/wordprocessingml/2006/main" xmlns:w14="http://schemas.microsoft.com/office/word/2010/wordml" xmlns:w15="http://schemas.microsoft.com/office/word/2012/wordml" xmlns:w16cex="http://schemas.microsoft.com/office/word/2018/wordml/cex" xmlns:w16cid="http://schemas.microsoft.com/office/word/2016/wordml/cid" xmlns:w16="http://schemas.microsoft.com/office/word/2018/wordml" xmlns:w16du="http://schemas.microsoft.com/office/word/2023/wordml/word16du" xmlns:w16sdtdh="http://schemas.microsoft.com/office/word/2020/wordml/sdtdatahash" xmlns:w16sdtfl="http://schemas.microsoft.com/office/word/2024/wordml/sdtformatlock" xmlns:w16se="http://schemas.microsoft.com/office/word/2015/wordml/symex" xmlns:wpg="http://schemas.microsoft.com/office/word/2010/wordprocessingGroup" xmlns:wpi="http://schemas.microsoft.com/office/word/2010/wordprocessingInk" xmlns:wne="http://schemas.microsoft.com/office/word/2006/wordml" xmlns:wps="http://schemas.microsoft.com/office/word/2010/wordprocessingShape" mc:Ignorable="w14 w15 w16se w16cid w16 w16cex w16sdtdh w16sdtfl w16du wp14">
+<w:document xmlns:wpc="http://schemas.microsoft.com/office/word/2010/wordprocessingCanvas" xmlns:cx="http://schemas.microsoft.com/office/drawing/2014/chartex" xmlns:cx1="http://schemas.microsoft.com/office/drawing/2015/9/8/chartex" xmlns:cx2="http://schemas.microsoft.com/office/drawing/2015/10/21/chartex" xmlns:cx3="http://schemas.microsoft.com/office/drawing/2016/5/9/chartex" xmlns:cx4="http://schemas.microsoft.com/office/drawing/2016/5/10/chartex" xmlns:cx5="http://schemas.microsoft.com/office/drawing/2016/5/11/chartex" xmlns:cx6="http://schemas.microsoft.com/office/drawing/2016/5/12/chartex" xmlns:cx7="http://schemas.microsoft.com/office/drawing/2016/5/13/chartex" xmlns:cx8="http://schemas.microsoft.com/office/drawing/2016/5/14/chartex" xmlns:mc="http://schemas.openxmlformats.org/markup-compatibility/2006" xmlns:aink="http://schemas.microsoft.com/office/drawing/2016/ink" xmlns:am3d="http://schemas.microsoft.com/office/drawing/2017/model3d" xmlns:o="urn:schemas-microsoft-com:office:office" xmlns:oel="http://schemas.microsoft.com/office/2019/extlst" xmlns:r="http://schemas.openxmlformats.org/officeDocument/2006/relationships" xmlns:m="http://schemas.openxmlformats.org/officeDocument/2006/math" xmlns:v="urn:schemas-microsoft-com:vml" xmlns:wp14="http://schemas.microsoft.com/office/word/2010/wordprocessingDrawing" xmlns:wp="http://schemas.openxmlformats.org/drawingml/2006/wordprocessingDrawing" xmlns:w10="urn:schemas-microsoft-com:office:word" xmlns:w="http://schemas.openxmlformats.org/wordprocessingml/2006/main" xmlns:w14="http://schemas.microsoft.com/office/word/2010/wordml" xmlns:w15="http://schemas.microsoft.com/office/word/2012/wordml" xmlns:w16cei="http://schemas.microsoft.com/office/word/2026/wordml/cei" xmlns:w16cex="http://schemas.microsoft.com/office/word/2018/wordml/cex" xmlns:w16cid="http://schemas.microsoft.com/office/word/2016/wordml/cid" xmlns:w16="http://schemas.microsoft.com/office/word/2018/wordml" xmlns:w16du="http://schemas.microsoft.com/office/word/2023/wordml/word16du" xmlns:w16sdtdh="http://schemas.microsoft.com/office/word/2020/wordml/sdtdatahash" xmlns:w16sdtfl="http://schemas.microsoft.com/office/word/2024/wordml/sdtformatlock" xmlns:w16se="http://schemas.microsoft.com/office/word/2015/wordml/symex" xmlns:wpg="http://schemas.microsoft.com/office/word/2010/wordprocessingGroup" xmlns:wpi="http://schemas.microsoft.com/office/word/2010/wordprocessingInk" xmlns:wne="http://schemas.microsoft.com/office/word/2006/wordml" xmlns:wps="http://schemas.microsoft.com/office/word/2010/wordprocessingShape" mc:Ignorable="w14 w15 w16se w16cid w16 w16cex w16sdtdh w16sdtfl w16du wp14">
   <w:body>
     <w:p>
       <w:pPr>
@@ -94,15 +94,7 @@
         <w:t xml:space="preserve">DONE: </w:t>
       </w:r>
       <w:r>
-        <w:t xml:space="preserve">Move pad labels to the bottom so that I can make the board narrower. Or </w:t>
-      </w:r>
-      <w:proofErr w:type="gramStart"/>
-      <w:r>
-        <w:t>remove</w:t>
-      </w:r>
-      <w:proofErr w:type="gramEnd"/>
-      <w:r>
-        <w:t xml:space="preserve"> altogether.</w:t>
+        <w:t>Move pad labels to the bottom so that I can make the board narrower. Or remove altogether.</w:t>
       </w:r>
     </w:p>
     <w:p>
@@ -161,13 +153,8 @@
       <w:r>
         <w:t xml:space="preserve">DONE: </w:t>
       </w:r>
-      <w:proofErr w:type="gramStart"/>
-      <w:r>
-        <w:t>Try with</w:t>
-      </w:r>
-      <w:proofErr w:type="gramEnd"/>
-      <w:r>
-        <w:t xml:space="preserve"> 0603 to see if it makes the board larger.</w:t>
+      <w:r>
+        <w:t>Try with 0603 to see if it makes the board larger.</w:t>
       </w:r>
     </w:p>
     <w:p>
@@ -292,15 +279,7 @@
         <w:t xml:space="preserve">DONE: </w:t>
       </w:r>
       <w:r>
-        <w:t xml:space="preserve">Update </w:t>
-      </w:r>
-      <w:proofErr w:type="spellStart"/>
-      <w:r>
-        <w:t>Vreg</w:t>
-      </w:r>
-      <w:proofErr w:type="spellEnd"/>
-      <w:r>
-        <w:t xml:space="preserve"> feedback calcs. R5 and R6 are reversed.</w:t>
+        <w:t>Update Vreg feedback calcs. R5 and R6 are reversed.</w:t>
       </w:r>
       <w:r>
         <w:t xml:space="preserve"> </w:t>
@@ -333,23 +312,7 @@
         <w:t xml:space="preserve">Skip for now: </w:t>
       </w:r>
       <w:r>
-        <w:t xml:space="preserve">Can I find a buck converter with a higher switching frequency and a smaller inductor? – Yes, higher </w:t>
-      </w:r>
-      <w:proofErr w:type="spellStart"/>
-      <w:r>
-        <w:t>freq</w:t>
-      </w:r>
-      <w:proofErr w:type="spellEnd"/>
-      <w:r>
-        <w:t xml:space="preserve"> (2.0 MHz vs 1.1 MHz), the inductor drops from 15μH to </w:t>
-      </w:r>
-      <w:proofErr w:type="gramStart"/>
-      <w:r>
-        <w:t>10μH, but</w:t>
-      </w:r>
-      <w:proofErr w:type="gramEnd"/>
-      <w:r>
-        <w:t xml:space="preserve"> ends up the same size. Consider integrated converter.</w:t>
+        <w:t>Can I find a buck converter with a higher switching frequency and a smaller inductor? – Yes, higher freq (2.0 MHz vs 1.1 MHz), the inductor drops from 15μH to 10μH, but ends up the same size. Consider integrated converter.</w:t>
       </w:r>
     </w:p>
     <w:p>
@@ -487,15 +450,7 @@
         <w:t xml:space="preserve">Future: </w:t>
       </w:r>
       <w:r>
-        <w:t xml:space="preserve">Test conducted RF from the regulator onto the Vin and </w:t>
-      </w:r>
-      <w:proofErr w:type="spellStart"/>
-      <w:r>
-        <w:t>Vout</w:t>
-      </w:r>
-      <w:proofErr w:type="spellEnd"/>
-      <w:r>
-        <w:t xml:space="preserve"> leads.</w:t>
+        <w:t>Test conducted RF from the regulator onto the Vin and Vout leads.</w:t>
       </w:r>
     </w:p>
     <w:p>
@@ -582,13 +537,8 @@
           <w:numId w:val="1"/>
         </w:numPr>
       </w:pPr>
-      <w:proofErr w:type="spellStart"/>
-      <w:r>
-        <w:t>Diotec</w:t>
-      </w:r>
-      <w:proofErr w:type="spellEnd"/>
-      <w:r>
-        <w:t xml:space="preserve"> SKM14 Schottky, 40V, 1A</w:t>
+      <w:r>
+        <w:t>Diotec SKM14 Schottky, 40V, 1A</w:t>
       </w:r>
       <w:r>
         <w:t>, SOD-123FL, 350mV@1A</w:t>
@@ -682,29 +632,151 @@
         <w:t xml:space="preserve">DONE: </w:t>
       </w:r>
       <w:r>
-        <w:t xml:space="preserve">Add dropping diodes or resistors for lower </w:t>
-      </w:r>
-      <w:proofErr w:type="spellStart"/>
-      <w:r>
-        <w:t>Vf</w:t>
-      </w:r>
-      <w:proofErr w:type="spellEnd"/>
-      <w:r>
-        <w:t xml:space="preserve"> diodes, like red and amber. This will reduce the heating in </w:t>
-      </w:r>
-      <w:proofErr w:type="gramStart"/>
-      <w:r>
-        <w:t>the TLC5971</w:t>
-      </w:r>
-      <w:proofErr w:type="gramEnd"/>
-      <w:r>
-        <w:t xml:space="preserve">. These could be populated with zero-ohm jumpers when not needed. It looks like 0603 resistors would be best, 16.0 or 16.5 ohm for 60 mA, only for LEDs with ~2.0 </w:t>
-      </w:r>
-      <w:proofErr w:type="spellStart"/>
-      <w:r>
-        <w:t>Vf</w:t>
-      </w:r>
-      <w:proofErr w:type="spellEnd"/>
+        <w:t>Add dropping diodes or resistors for lower Vf diodes, like red and amber. This will reduce the heating in the TLC5971. These could be populated with zero-ohm jumpers when not needed. It looks like 0603 resistors would be best, 16.0 or 16.5 ohm for 60 mA, only for LEDs with ~2.0 Vf.</w:t>
+      </w:r>
+    </w:p>
+    <w:p>
+      <w:pPr>
+        <w:pStyle w:val="ListParagraph"/>
+        <w:numPr>
+          <w:ilvl w:val="1"/>
+          <w:numId w:val="1"/>
+        </w:numPr>
+      </w:pPr>
+      <w:r>
+        <w:t xml:space="preserve">Rohm </w:t>
+      </w:r>
+      <w:r>
+        <w:t>ESR03EZPF16R5</w:t>
+      </w:r>
+      <w:r>
+        <w:t>, 16.5Ω, 1%, 0.25W, 100 ppm/°C, thick film, 0603</w:t>
+      </w:r>
+    </w:p>
+    <w:p>
+      <w:pPr>
+        <w:pStyle w:val="ListParagraph"/>
+        <w:numPr>
+          <w:ilvl w:val="1"/>
+          <w:numId w:val="1"/>
+        </w:numPr>
+      </w:pPr>
+      <w:r>
+        <w:t xml:space="preserve">Panasonic </w:t>
+      </w:r>
+      <w:r>
+        <w:t>ERJ-PA3F16R0V</w:t>
+      </w:r>
+      <w:r>
+        <w:t>, 16.0Ω, 1%, 0.33W, 100 ppm/°C, thick film, 0603</w:t>
+      </w:r>
+    </w:p>
+    <w:p>
+      <w:pPr>
+        <w:pStyle w:val="ListParagraph"/>
+        <w:numPr>
+          <w:ilvl w:val="1"/>
+          <w:numId w:val="1"/>
+        </w:numPr>
+      </w:pPr>
+      <w:r>
+        <w:t xml:space="preserve">Vishay Dale </w:t>
+      </w:r>
+      <w:r>
+        <w:t>CRCW06038R20FKEAHP</w:t>
+      </w:r>
+      <w:r>
+        <w:t>, 8.2Ω, 1%, 0.33W, 100 ppm/°C, thick film, 0603</w:t>
+      </w:r>
+    </w:p>
+    <w:p>
+      <w:pPr>
+        <w:pStyle w:val="ListParagraph"/>
+        <w:numPr>
+          <w:ilvl w:val="0"/>
+          <w:numId w:val="1"/>
+        </w:numPr>
+      </w:pPr>
+      <w:r>
+        <w:t xml:space="preserve">Skip: </w:t>
+      </w:r>
+      <w:r>
+        <w:t xml:space="preserve">Consider dual drivers to allow 2X the power. </w:t>
+      </w:r>
+      <w:r>
+        <w:t>Would likely overheat the PCB and LEDs.</w:t>
+      </w:r>
+    </w:p>
+    <w:p>
+      <w:pPr>
+        <w:pStyle w:val="Heading2"/>
+      </w:pPr>
+      <w:r>
+        <w:t>LEDs</w:t>
+      </w:r>
+    </w:p>
+    <w:p>
+      <w:pPr>
+        <w:pStyle w:val="ListParagraph"/>
+        <w:numPr>
+          <w:ilvl w:val="0"/>
+          <w:numId w:val="1"/>
+        </w:numPr>
+      </w:pPr>
+      <w:r>
+        <w:t xml:space="preserve">DONE: </w:t>
+      </w:r>
+      <w:r>
+        <w:t>Center LEDs on the PCB and align the corner holes to be symmetrical.</w:t>
+      </w:r>
+    </w:p>
+    <w:p>
+      <w:pPr>
+        <w:pStyle w:val="ListParagraph"/>
+        <w:numPr>
+          <w:ilvl w:val="0"/>
+          <w:numId w:val="1"/>
+        </w:numPr>
+      </w:pPr>
+      <w:r>
+        <w:t xml:space="preserve">DONE: </w:t>
+      </w:r>
+      <w:r>
+        <w:t>Larger LED cathode mark</w:t>
+      </w:r>
+      <w:r>
+        <w:t xml:space="preserve"> in copper (it’s not really visible)</w:t>
+      </w:r>
+      <w:r>
+        <w:t>. Or remove and just use silkscreen.</w:t>
+      </w:r>
+    </w:p>
+    <w:p>
+      <w:pPr>
+        <w:pStyle w:val="ListParagraph"/>
+        <w:numPr>
+          <w:ilvl w:val="0"/>
+          <w:numId w:val="1"/>
+        </w:numPr>
+      </w:pPr>
+      <w:r>
+        <w:t xml:space="preserve">DONE: </w:t>
+      </w:r>
+      <w:r>
+        <w:t>For the Luxeon C</w:t>
+      </w:r>
+      <w:r>
+        <w:t>Z</w:t>
+      </w:r>
+      <w:r>
+        <w:t xml:space="preserve"> LEDs, m</w:t>
+      </w:r>
+      <w:r>
+        <w:t>ake LED pads slightly taller, maybe 0.1 to 0.2 mm on each end</w:t>
+      </w:r>
+      <w:r>
+        <w:t xml:space="preserve"> (right now, they are fully covered on both ends)</w:t>
+      </w:r>
       <w:r>
         <w:t>.</w:t>
       </w:r>
@@ -713,85 +785,116 @@
       <w:pPr>
         <w:pStyle w:val="ListParagraph"/>
         <w:numPr>
-          <w:ilvl w:val="1"/>
-          <w:numId w:val="1"/>
-        </w:numPr>
-      </w:pPr>
-      <w:r>
-        <w:t xml:space="preserve">Rohm </w:t>
-      </w:r>
-      <w:r>
-        <w:t>ESR03EZPF16R5</w:t>
-      </w:r>
-      <w:r>
-        <w:t>, 16.5Ω, 1%, 0.25W, 100 ppm/°C, thick film, 0603</w:t>
-      </w:r>
-    </w:p>
-    <w:p>
-      <w:pPr>
-        <w:pStyle w:val="ListParagraph"/>
-        <w:numPr>
-          <w:ilvl w:val="1"/>
-          <w:numId w:val="1"/>
-        </w:numPr>
-      </w:pPr>
-      <w:r>
-        <w:t xml:space="preserve">Panasonic </w:t>
-      </w:r>
-      <w:r>
-        <w:t>ERJ-PA3F16R0V</w:t>
-      </w:r>
-      <w:r>
-        <w:t>, 16.0Ω, 1%, 0.33W, 100 ppm/°C, thick film, 0603</w:t>
-      </w:r>
-    </w:p>
-    <w:p>
-      <w:pPr>
-        <w:pStyle w:val="ListParagraph"/>
-        <w:numPr>
-          <w:ilvl w:val="1"/>
-          <w:numId w:val="1"/>
-        </w:numPr>
-      </w:pPr>
-      <w:r>
-        <w:t xml:space="preserve">Vishay Dale </w:t>
-      </w:r>
-      <w:r>
-        <w:t>CRCW06038R20FKEAHP</w:t>
-      </w:r>
-      <w:r>
-        <w:t>, 8.2Ω, 1%, 0.33W, 100 ppm/°C, thick film, 0603</w:t>
-      </w:r>
-    </w:p>
-    <w:p>
-      <w:pPr>
-        <w:pStyle w:val="ListParagraph"/>
-        <w:numPr>
-          <w:ilvl w:val="0"/>
-          <w:numId w:val="1"/>
-        </w:numPr>
-      </w:pPr>
-      <w:r>
-        <w:t xml:space="preserve">Skip: </w:t>
-      </w:r>
-      <w:r>
-        <w:t xml:space="preserve">Consider dual drivers to allow 2X </w:t>
-      </w:r>
-      <w:proofErr w:type="gramStart"/>
-      <w:r>
-        <w:t>the power</w:t>
-      </w:r>
-      <w:proofErr w:type="gramEnd"/>
-      <w:r>
-        <w:t xml:space="preserve">. </w:t>
-      </w:r>
-      <w:proofErr w:type="gramStart"/>
-      <w:r>
-        <w:t>Would</w:t>
-      </w:r>
-      <w:proofErr w:type="gramEnd"/>
-      <w:r>
-        <w:t xml:space="preserve"> likely overheat the PCB and LEDs.</w:t>
+          <w:ilvl w:val="0"/>
+          <w:numId w:val="1"/>
+        </w:numPr>
+      </w:pPr>
+      <w:r>
+        <w:t xml:space="preserve">DONE: </w:t>
+      </w:r>
+      <w:r>
+        <w:t>Consider LED diffuser mounting</w:t>
+      </w:r>
+      <w:r>
+        <w:t xml:space="preserve"> holes</w:t>
+      </w:r>
+      <w:r>
+        <w:t>.</w:t>
+      </w:r>
+    </w:p>
+    <w:p>
+      <w:pPr>
+        <w:pStyle w:val="ListParagraph"/>
+        <w:numPr>
+          <w:ilvl w:val="0"/>
+          <w:numId w:val="1"/>
+        </w:numPr>
+      </w:pPr>
+      <w:r>
+        <w:t xml:space="preserve">DONE: </w:t>
+      </w:r>
+      <w:r>
+        <w:t>Leave a clear margin around the LEDs for</w:t>
+      </w:r>
+      <w:r>
+        <w:t xml:space="preserve"> light shaping / diffusing</w:t>
+      </w:r>
+    </w:p>
+    <w:p>
+      <w:pPr>
+        <w:pStyle w:val="ListParagraph"/>
+        <w:numPr>
+          <w:ilvl w:val="0"/>
+          <w:numId w:val="1"/>
+        </w:numPr>
+      </w:pPr>
+      <w:r>
+        <w:t xml:space="preserve">DONE: </w:t>
+      </w:r>
+      <w:r>
+        <w:t xml:space="preserve">Leave </w:t>
+      </w:r>
+      <w:r>
+        <w:t>~</w:t>
+      </w:r>
+      <w:r>
+        <w:t>1mm between LEDs for barrier to block blue/violet from white phosphors</w:t>
+      </w:r>
+      <w:r>
+        <w:t>. This may not be needed if I use flat</w:t>
+      </w:r>
+      <w:r>
+        <w:t xml:space="preserve"> top LEDs (no lens).</w:t>
+      </w:r>
+    </w:p>
+    <w:p>
+      <w:pPr>
+        <w:pStyle w:val="ListParagraph"/>
+        <w:numPr>
+          <w:ilvl w:val="0"/>
+          <w:numId w:val="1"/>
+        </w:numPr>
+      </w:pPr>
+      <w:r>
+        <w:t>DONE: Use a mixture of OSLON Pure 1414, Cree XE-G, and Luxeon CZ LED</w:t>
+      </w:r>
+      <w:r>
+        <w:t xml:space="preserve"> </w:t>
+      </w:r>
+      <w:r>
+        <w:t xml:space="preserve">since </w:t>
+      </w:r>
+      <w:r>
+        <w:t>we are only driving 60 mA</w:t>
+      </w:r>
+      <w:r>
+        <w:t xml:space="preserve"> to 120 mA. This will save money and space.</w:t>
+      </w:r>
+    </w:p>
+    <w:p>
+      <w:pPr>
+        <w:pStyle w:val="ListParagraph"/>
+        <w:numPr>
+          <w:ilvl w:val="0"/>
+          <w:numId w:val="1"/>
+        </w:numPr>
+      </w:pPr>
+      <w:r>
+        <w:t>DONE: Change to a shorter wavelength violet</w:t>
+      </w:r>
+      <w:r>
+        <w:t xml:space="preserve"> (410 nm instead of </w:t>
+      </w:r>
+      <w:r>
+        <w:t>425 nm)</w:t>
+      </w:r>
+    </w:p>
+    <w:p>
+      <w:pPr>
+        <w:pStyle w:val="Heading1"/>
+      </w:pPr>
+      <w:r>
+        <w:t>Revision v2b – 2025-10-08</w:t>
       </w:r>
     </w:p>
     <w:p>
@@ -799,205 +902,43 @@
         <w:pStyle w:val="Heading2"/>
       </w:pPr>
       <w:r>
-        <w:t>LEDs</w:t>
-      </w:r>
-    </w:p>
-    <w:p>
-      <w:pPr>
-        <w:pStyle w:val="ListParagraph"/>
-        <w:numPr>
-          <w:ilvl w:val="0"/>
-          <w:numId w:val="1"/>
-        </w:numPr>
-      </w:pPr>
-      <w:r>
-        <w:t xml:space="preserve">DONE: </w:t>
-      </w:r>
-      <w:r>
-        <w:t>Center LEDs on the PCB and align the corner holes to be symmetrical.</w:t>
-      </w:r>
-    </w:p>
-    <w:p>
-      <w:pPr>
-        <w:pStyle w:val="ListParagraph"/>
-        <w:numPr>
-          <w:ilvl w:val="0"/>
-          <w:numId w:val="1"/>
-        </w:numPr>
-      </w:pPr>
-      <w:r>
-        <w:t xml:space="preserve">DONE: </w:t>
-      </w:r>
-      <w:r>
-        <w:t>Larger LED cathode mark</w:t>
-      </w:r>
-      <w:r>
-        <w:t xml:space="preserve"> in copper (it’s not </w:t>
-      </w:r>
-      <w:proofErr w:type="gramStart"/>
-      <w:r>
-        <w:t>really visible</w:t>
-      </w:r>
-      <w:proofErr w:type="gramEnd"/>
-      <w:r>
-        <w:t>)</w:t>
-      </w:r>
-      <w:r>
-        <w:t>. Or remove and just use silkscreen.</w:t>
-      </w:r>
-    </w:p>
-    <w:p>
-      <w:pPr>
-        <w:pStyle w:val="ListParagraph"/>
-        <w:numPr>
-          <w:ilvl w:val="0"/>
-          <w:numId w:val="1"/>
-        </w:numPr>
-      </w:pPr>
-      <w:r>
-        <w:t xml:space="preserve">DONE: </w:t>
-      </w:r>
-      <w:r>
-        <w:t xml:space="preserve">For the </w:t>
-      </w:r>
-      <w:proofErr w:type="spellStart"/>
-      <w:r>
-        <w:t>Luxeon</w:t>
-      </w:r>
-      <w:proofErr w:type="spellEnd"/>
-      <w:r>
-        <w:t xml:space="preserve"> C</w:t>
-      </w:r>
-      <w:r>
-        <w:t>Z</w:t>
-      </w:r>
-      <w:r>
-        <w:t xml:space="preserve"> LEDs, m</w:t>
-      </w:r>
-      <w:r>
-        <w:t>ake LED pads slightly taller, maybe 0.1 to 0.2 mm on each end</w:t>
-      </w:r>
-      <w:r>
-        <w:t xml:space="preserve"> (right now, they are fully covered on both ends)</w:t>
-      </w:r>
-      <w:r>
-        <w:t>.</w:t>
-      </w:r>
-    </w:p>
-    <w:p>
-      <w:pPr>
-        <w:pStyle w:val="ListParagraph"/>
-        <w:numPr>
-          <w:ilvl w:val="0"/>
-          <w:numId w:val="1"/>
-        </w:numPr>
-      </w:pPr>
-      <w:r>
-        <w:t xml:space="preserve">DONE: </w:t>
-      </w:r>
-      <w:r>
-        <w:t>Consider LED diffuser mounting</w:t>
-      </w:r>
-      <w:r>
-        <w:t xml:space="preserve"> holes</w:t>
-      </w:r>
-      <w:r>
-        <w:t>.</w:t>
-      </w:r>
-    </w:p>
-    <w:p>
-      <w:pPr>
-        <w:pStyle w:val="ListParagraph"/>
-        <w:numPr>
-          <w:ilvl w:val="0"/>
-          <w:numId w:val="1"/>
-        </w:numPr>
-      </w:pPr>
-      <w:r>
-        <w:t xml:space="preserve">DONE: </w:t>
-      </w:r>
-      <w:r>
-        <w:t>Leave a clear margin around the LEDs for</w:t>
-      </w:r>
-      <w:r>
-        <w:t xml:space="preserve"> light shaping / diffusing</w:t>
-      </w:r>
-    </w:p>
-    <w:p>
-      <w:pPr>
-        <w:pStyle w:val="ListParagraph"/>
-        <w:numPr>
-          <w:ilvl w:val="0"/>
-          <w:numId w:val="1"/>
-        </w:numPr>
-      </w:pPr>
-      <w:r>
-        <w:t xml:space="preserve">DONE: </w:t>
-      </w:r>
-      <w:r>
-        <w:t xml:space="preserve">Leave </w:t>
-      </w:r>
-      <w:r>
-        <w:t>~</w:t>
-      </w:r>
-      <w:r>
-        <w:t>1mm between LEDs for barrier to block blue/violet from white phosphors</w:t>
-      </w:r>
-      <w:r>
-        <w:t>. This may not be needed if I use flat</w:t>
-      </w:r>
-      <w:r>
-        <w:t xml:space="preserve"> top LEDs (no lens).</w:t>
-      </w:r>
-    </w:p>
-    <w:p>
-      <w:pPr>
-        <w:pStyle w:val="ListParagraph"/>
-        <w:numPr>
-          <w:ilvl w:val="0"/>
-          <w:numId w:val="1"/>
-        </w:numPr>
-      </w:pPr>
-      <w:r>
-        <w:t xml:space="preserve">DONE: Use a mixture of OSLON Pure 1414, Cree XE-G, and </w:t>
-      </w:r>
-      <w:proofErr w:type="spellStart"/>
-      <w:r>
-        <w:t>Luxeon</w:t>
-      </w:r>
-      <w:proofErr w:type="spellEnd"/>
-      <w:r>
-        <w:t xml:space="preserve"> CZ LED</w:t>
-      </w:r>
-      <w:r>
-        <w:t xml:space="preserve"> </w:t>
-      </w:r>
-      <w:r>
-        <w:t xml:space="preserve">since </w:t>
-      </w:r>
-      <w:r>
-        <w:t>we are only driving 60 mA</w:t>
-      </w:r>
-      <w:r>
-        <w:t xml:space="preserve"> to 120 mA. This will save money and space.</w:t>
-      </w:r>
-    </w:p>
-    <w:p>
-      <w:pPr>
-        <w:pStyle w:val="ListParagraph"/>
-        <w:numPr>
-          <w:ilvl w:val="0"/>
-          <w:numId w:val="1"/>
-        </w:numPr>
-      </w:pPr>
-      <w:r>
-        <w:t>DONE: Change to a shorter wavelength violet</w:t>
-      </w:r>
-      <w:r>
-        <w:t xml:space="preserve"> (410 nm instead of </w:t>
-      </w:r>
-      <w:r>
-        <w:t>425 nm)</w:t>
+        <w:t>General</w:t>
+      </w:r>
+    </w:p>
+    <w:p>
+      <w:pPr>
+        <w:pStyle w:val="ListParagraph"/>
+        <w:numPr>
+          <w:ilvl w:val="0"/>
+          <w:numId w:val="1"/>
+        </w:numPr>
+      </w:pPr>
+      <w:r>
+        <w:t xml:space="preserve">Remove corner holes from the solder paste stencil. </w:t>
+      </w:r>
+    </w:p>
+    <w:p>
+      <w:pPr>
+        <w:pStyle w:val="ListParagraph"/>
+        <w:numPr>
+          <w:ilvl w:val="0"/>
+          <w:numId w:val="1"/>
+        </w:numPr>
+      </w:pPr>
+      <w:r>
+        <w:t>Adjust solder paste expansion.</w:t>
+      </w:r>
+    </w:p>
+    <w:p>
+      <w:pPr>
+        <w:pStyle w:val="ListParagraph"/>
+        <w:numPr>
+          <w:ilvl w:val="0"/>
+          <w:numId w:val="1"/>
+        </w:numPr>
+      </w:pPr>
+      <w:r>
+        <w:t>Adjust solder paste stencil size and thickness.</w:t>
       </w:r>
     </w:p>
     <w:p>
@@ -1005,16 +946,16 @@
         <w:pStyle w:val="Heading1"/>
       </w:pPr>
       <w:r>
-        <w:t>Revision v2</w:t>
-      </w:r>
-      <w:r>
-        <w:t>b</w:t>
-      </w:r>
-      <w:r>
-        <w:t xml:space="preserve"> – 2025-</w:t>
-      </w:r>
-      <w:r>
-        <w:t>10-08</w:t>
+        <w:t>Revision v</w:t>
+      </w:r>
+      <w:r>
+        <w:t>3</w:t>
+      </w:r>
+      <w:r>
+        <w:t xml:space="preserve"> – </w:t>
+      </w:r>
+      <w:r>
+        <w:t>tbd</w:t>
       </w:r>
     </w:p>
     <w:p>
@@ -1022,43 +963,19 @@
         <w:pStyle w:val="Heading2"/>
       </w:pPr>
       <w:r>
-        <w:t>General</w:t>
-      </w:r>
-    </w:p>
-    <w:p>
-      <w:pPr>
-        <w:pStyle w:val="ListParagraph"/>
-        <w:numPr>
-          <w:ilvl w:val="0"/>
-          <w:numId w:val="1"/>
-        </w:numPr>
-      </w:pPr>
-      <w:r>
-        <w:t xml:space="preserve">Remove corner holes from the solder paste stencil. </w:t>
-      </w:r>
-    </w:p>
-    <w:p>
-      <w:pPr>
-        <w:pStyle w:val="ListParagraph"/>
-        <w:numPr>
-          <w:ilvl w:val="0"/>
-          <w:numId w:val="1"/>
-        </w:numPr>
-      </w:pPr>
-      <w:r>
-        <w:t>Adjust solder paste expansion.</w:t>
-      </w:r>
-    </w:p>
-    <w:p>
-      <w:pPr>
-        <w:pStyle w:val="ListParagraph"/>
-        <w:numPr>
-          <w:ilvl w:val="0"/>
-          <w:numId w:val="1"/>
-        </w:numPr>
-      </w:pPr>
-      <w:r>
-        <w:t>Adjust solder paste stencil size and thickness.</w:t>
+        <w:t>Future</w:t>
+      </w:r>
+    </w:p>
+    <w:p>
+      <w:pPr>
+        <w:pStyle w:val="ListParagraph"/>
+        <w:numPr>
+          <w:ilvl w:val="0"/>
+          <w:numId w:val="1"/>
+        </w:numPr>
+      </w:pPr>
+      <w:r>
+        <w:t>Add fiducials</w:t>
       </w:r>
     </w:p>
     <w:p/>
@@ -1069,7 +986,6 @@
     <w:p/>
     <w:p/>
     <w:p/>
-    <w:p/>
     <w:p>
       <w:pPr>
         <w:pStyle w:val="Heading2"/>
@@ -1198,15 +1114,7 @@
         </w:numPr>
       </w:pPr>
       <w:r>
-        <w:t>Far Red 735 (</w:t>
-      </w:r>
-      <w:proofErr w:type="spellStart"/>
-      <w:r>
-        <w:t>Luxeon</w:t>
-      </w:r>
-      <w:proofErr w:type="spellEnd"/>
-      <w:r>
-        <w:t>)</w:t>
+        <w:t>Far Red 735 (Luxeon)</w:t>
       </w:r>
     </w:p>
     <w:p>
@@ -1398,7 +1306,7 @@
 </file>
 
 <file path=word/numbering.xml><?xml version="1.0" encoding="utf-8"?>
-<w:numbering xmlns:wpc="http://schemas.microsoft.com/office/word/2010/wordprocessingCanvas" xmlns:cx="http://schemas.microsoft.com/office/drawing/2014/chartex" xmlns:cx1="http://schemas.microsoft.com/office/drawing/2015/9/8/chartex" xmlns:cx2="http://schemas.microsoft.com/office/drawing/2015/10/21/chartex" xmlns:cx3="http://schemas.microsoft.com/office/drawing/2016/5/9/chartex" xmlns:cx4="http://schemas.microsoft.com/office/drawing/2016/5/10/chartex" xmlns:cx5="http://schemas.microsoft.com/office/drawing/2016/5/11/chartex" xmlns:cx6="http://schemas.microsoft.com/office/drawing/2016/5/12/chartex" xmlns:cx7="http://schemas.microsoft.com/office/drawing/2016/5/13/chartex" xmlns:cx8="http://schemas.microsoft.com/office/drawing/2016/5/14/chartex" xmlns:mc="http://schemas.openxmlformats.org/markup-compatibility/2006" xmlns:aink="http://schemas.microsoft.com/office/drawing/2016/ink" xmlns:am3d="http://schemas.microsoft.com/office/drawing/2017/model3d" xmlns:o="urn:schemas-microsoft-com:office:office" xmlns:oel="http://schemas.microsoft.com/office/2019/extlst" xmlns:r="http://schemas.openxmlformats.org/officeDocument/2006/relationships" xmlns:m="http://schemas.openxmlformats.org/officeDocument/2006/math" xmlns:v="urn:schemas-microsoft-com:vml" xmlns:wp14="http://schemas.microsoft.com/office/word/2010/wordprocessingDrawing" xmlns:wp="http://schemas.openxmlformats.org/drawingml/2006/wordprocessingDrawing" xmlns:w10="urn:schemas-microsoft-com:office:word" xmlns:w="http://schemas.openxmlformats.org/wordprocessingml/2006/main" xmlns:w14="http://schemas.microsoft.com/office/word/2010/wordml" xmlns:w15="http://schemas.microsoft.com/office/word/2012/wordml" xmlns:w16cex="http://schemas.microsoft.com/office/word/2018/wordml/cex" xmlns:w16cid="http://schemas.microsoft.com/office/word/2016/wordml/cid" xmlns:w16="http://schemas.microsoft.com/office/word/2018/wordml" xmlns:w16du="http://schemas.microsoft.com/office/word/2023/wordml/word16du" xmlns:w16sdtdh="http://schemas.microsoft.com/office/word/2020/wordml/sdtdatahash" xmlns:w16sdtfl="http://schemas.microsoft.com/office/word/2024/wordml/sdtformatlock" xmlns:w16se="http://schemas.microsoft.com/office/word/2015/wordml/symex" xmlns:wpg="http://schemas.microsoft.com/office/word/2010/wordprocessingGroup" xmlns:wpi="http://schemas.microsoft.com/office/word/2010/wordprocessingInk" xmlns:wne="http://schemas.microsoft.com/office/word/2006/wordml" xmlns:wps="http://schemas.microsoft.com/office/word/2010/wordprocessingShape" mc:Ignorable="w14 w15 w16se w16cid w16 w16cex w16sdtdh w16sdtfl w16du wp14">
+<w:numbering xmlns:wpc="http://schemas.microsoft.com/office/word/2010/wordprocessingCanvas" xmlns:cx="http://schemas.microsoft.com/office/drawing/2014/chartex" xmlns:cx1="http://schemas.microsoft.com/office/drawing/2015/9/8/chartex" xmlns:cx2="http://schemas.microsoft.com/office/drawing/2015/10/21/chartex" xmlns:cx3="http://schemas.microsoft.com/office/drawing/2016/5/9/chartex" xmlns:cx4="http://schemas.microsoft.com/office/drawing/2016/5/10/chartex" xmlns:cx5="http://schemas.microsoft.com/office/drawing/2016/5/11/chartex" xmlns:cx6="http://schemas.microsoft.com/office/drawing/2016/5/12/chartex" xmlns:cx7="http://schemas.microsoft.com/office/drawing/2016/5/13/chartex" xmlns:cx8="http://schemas.microsoft.com/office/drawing/2016/5/14/chartex" xmlns:mc="http://schemas.openxmlformats.org/markup-compatibility/2006" xmlns:aink="http://schemas.microsoft.com/office/drawing/2016/ink" xmlns:am3d="http://schemas.microsoft.com/office/drawing/2017/model3d" xmlns:o="urn:schemas-microsoft-com:office:office" xmlns:oel="http://schemas.microsoft.com/office/2019/extlst" xmlns:r="http://schemas.openxmlformats.org/officeDocument/2006/relationships" xmlns:m="http://schemas.openxmlformats.org/officeDocument/2006/math" xmlns:v="urn:schemas-microsoft-com:vml" xmlns:wp14="http://schemas.microsoft.com/office/word/2010/wordprocessingDrawing" xmlns:wp="http://schemas.openxmlformats.org/drawingml/2006/wordprocessingDrawing" xmlns:w10="urn:schemas-microsoft-com:office:word" xmlns:w="http://schemas.openxmlformats.org/wordprocessingml/2006/main" xmlns:w14="http://schemas.microsoft.com/office/word/2010/wordml" xmlns:w15="http://schemas.microsoft.com/office/word/2012/wordml" xmlns:w16cei="http://schemas.microsoft.com/office/word/2026/wordml/cei" xmlns:w16cex="http://schemas.microsoft.com/office/word/2018/wordml/cex" xmlns:w16cid="http://schemas.microsoft.com/office/word/2016/wordml/cid" xmlns:w16="http://schemas.microsoft.com/office/word/2018/wordml" xmlns:w16du="http://schemas.microsoft.com/office/word/2023/wordml/word16du" xmlns:w16sdtdh="http://schemas.microsoft.com/office/word/2020/wordml/sdtdatahash" xmlns:w16sdtfl="http://schemas.microsoft.com/office/word/2024/wordml/sdtformatlock" xmlns:w16se="http://schemas.microsoft.com/office/word/2015/wordml/symex" xmlns:wpg="http://schemas.microsoft.com/office/word/2010/wordprocessingGroup" xmlns:wpi="http://schemas.microsoft.com/office/word/2010/wordprocessingInk" xmlns:wne="http://schemas.microsoft.com/office/word/2006/wordml" xmlns:wps="http://schemas.microsoft.com/office/word/2010/wordprocessingShape" mc:Ignorable="w14 w15 w16se w16cid w16 w16cex w16sdtdh w16sdtfl w16du wp14">
   <w:abstractNum w:abstractNumId="0" w15:restartNumberingAfterBreak="0">
     <w:nsid w:val="0FA56780"/>
     <w:multiLevelType w:val="hybridMultilevel"/>

</xml_diff>